<commit_message>
update readme for setup
</commit_message>
<xml_diff>
--- a/Winget/HowTo.docx
+++ b/Winget/HowTo.docx
@@ -18,41 +18,19 @@
         <w:t>🚀</w:t>
       </w:r>
       <w:r>
-        <w:t xml:space="preserve"> Steps to Create and Publish a </w:t>
-      </w:r>
-      <w:proofErr w:type="spellStart"/>
-      <w:r>
-        <w:t>WinGet</w:t>
-      </w:r>
-      <w:proofErr w:type="spellEnd"/>
-      <w:r>
-        <w:t xml:space="preserve"> Package for </w:t>
-      </w:r>
-      <w:proofErr w:type="spellStart"/>
-      <w:r>
-        <w:t>Tracetool</w:t>
-      </w:r>
-      <w:proofErr w:type="spellEnd"/>
+        <w:t xml:space="preserve"> Steps to Create and Publish a WinGet Package for Tracetool</w:t>
+      </w:r>
     </w:p>
     <w:p>
       <w:r>
         <w:t xml:space="preserve">Since your app includes an .exe, DLLs, folders, and a configuration file, you'll need to package it properly and create a </w:t>
       </w:r>
-      <w:proofErr w:type="spellStart"/>
       <w:r>
         <w:rPr>
           <w:b/>
           <w:bCs/>
         </w:rPr>
-        <w:t>WinGet</w:t>
-      </w:r>
-      <w:proofErr w:type="spellEnd"/>
-      <w:r>
-        <w:rPr>
-          <w:b/>
-          <w:bCs/>
-        </w:rPr>
-        <w:t xml:space="preserve"> manifest</w:t>
+        <w:t>WinGet manifest</w:t>
       </w:r>
       <w:r>
         <w:t>. Here's the full process:</w:t>
@@ -67,266 +45,10 @@
     </w:p>
     <w:p>
       <w:r>
-        <w:t>Step 1: Prepare Your Installer</w:t>
-      </w:r>
-    </w:p>
-    <w:p>
-      <w:pPr>
-        <w:rPr>
-          <w:b/>
-          <w:bCs/>
-        </w:rPr>
-      </w:pPr>
-      <w:proofErr w:type="spellStart"/>
-      <w:r>
-        <w:rPr>
-          <w:b/>
-          <w:bCs/>
-        </w:rPr>
-        <w:t>winget</w:t>
-      </w:r>
-      <w:proofErr w:type="spellEnd"/>
-      <w:r>
-        <w:rPr>
-          <w:b/>
-          <w:bCs/>
-        </w:rPr>
-        <w:t xml:space="preserve"> install -e --id </w:t>
-      </w:r>
-      <w:proofErr w:type="spellStart"/>
-      <w:r>
-        <w:rPr>
-          <w:b/>
-          <w:bCs/>
-        </w:rPr>
-        <w:t>JRSoftware.InnoSetup</w:t>
-      </w:r>
-      <w:proofErr w:type="spellEnd"/>
-    </w:p>
-    <w:p>
-      <w:pPr>
-        <w:rPr>
-          <w:b/>
-          <w:bCs/>
-        </w:rPr>
-      </w:pPr>
-      <w:r>
-        <w:rPr>
-          <w:b/>
-          <w:bCs/>
-        </w:rPr>
-        <w:t xml:space="preserve">"C:\Users\tparent\AppData\Local\Programs\Inno Setup 6\Compil32.exe" /cc </w:t>
-      </w:r>
-      <w:proofErr w:type="spellStart"/>
-      <w:r>
-        <w:rPr>
-          <w:b/>
-          <w:bCs/>
-        </w:rPr>
-        <w:t>tracetool.iss</w:t>
-      </w:r>
-      <w:proofErr w:type="spellEnd"/>
-    </w:p>
-    <w:p>
-      <w:r>
-        <w:pict w14:anchorId="06526AF3">
-          <v:rect id="_x0000_i1026" style="width:0;height:1.5pt" o:hralign="center" o:hrstd="t" o:hr="t" fillcolor="#a0a0a0" stroked="f"/>
-        </w:pict>
-      </w:r>
-    </w:p>
-    <w:p>
-      <w:r>
-        <w:t>Step 2: Host the Installer Online</w:t>
-      </w:r>
-    </w:p>
-    <w:p>
-      <w:proofErr w:type="spellStart"/>
-      <w:r>
-        <w:t>WinGet</w:t>
-      </w:r>
-      <w:proofErr w:type="spellEnd"/>
-      <w:r>
-        <w:t xml:space="preserve"> requires a </w:t>
-      </w:r>
-      <w:r>
-        <w:rPr>
-          <w:b/>
-          <w:bCs/>
-        </w:rPr>
-        <w:t>direct download link</w:t>
-      </w:r>
-      <w:r>
-        <w:t xml:space="preserve"> for your installer.</w:t>
-      </w:r>
-    </w:p>
-    <w:p>
-      <w:pPr>
-        <w:numPr>
-          <w:ilvl w:val="0"/>
-          <w:numId w:val="25"/>
-        </w:numPr>
-      </w:pPr>
-      <w:r>
-        <w:t>If you have a website, upload it there.</w:t>
-      </w:r>
-    </w:p>
-    <w:p>
-      <w:pPr>
-        <w:numPr>
-          <w:ilvl w:val="0"/>
-          <w:numId w:val="25"/>
-        </w:numPr>
-      </w:pPr>
-      <w:r>
-        <w:t xml:space="preserve">Otherwise, use </w:t>
-      </w:r>
-      <w:r>
-        <w:rPr>
-          <w:b/>
-          <w:bCs/>
-        </w:rPr>
-        <w:t>GitHub Releases</w:t>
-      </w:r>
-      <w:r>
-        <w:t>, a cloud service (Google Drive, OneDrive), or another direct link.</w:t>
-      </w:r>
-    </w:p>
-    <w:p>
-      <w:r>
-        <w:t>Example:</w:t>
-      </w:r>
-    </w:p>
-    <w:p>
-      <w:pPr>
-        <w:numPr>
-          <w:ilvl w:val="0"/>
-          <w:numId w:val="26"/>
-        </w:numPr>
-      </w:pPr>
-      <w:r>
-        <w:rPr>
-          <w:rFonts w:ascii="Segoe UI Emoji" w:hAnsi="Segoe UI Emoji" w:cs="Segoe UI Emoji"/>
-        </w:rPr>
-        <w:t>✅</w:t>
-      </w:r>
-      <w:r>
-        <w:t xml:space="preserve"> https://yourwebsite.com/tracetool/setup.exe</w:t>
-      </w:r>
-    </w:p>
-    <w:p>
-      <w:pPr>
-        <w:numPr>
-          <w:ilvl w:val="0"/>
-          <w:numId w:val="26"/>
-        </w:numPr>
-      </w:pPr>
-      <w:r>
-        <w:rPr>
-          <w:rFonts w:ascii="Segoe UI Emoji" w:hAnsi="Segoe UI Emoji" w:cs="Segoe UI Emoji"/>
-        </w:rPr>
-        <w:t>✅</w:t>
-      </w:r>
-      <w:r>
-        <w:t xml:space="preserve"> https://github.com/yourrepo/releases/download/v1.0/tracetool.zip</w:t>
-      </w:r>
-    </w:p>
-    <w:p>
-      <w:pPr>
-        <w:numPr>
-          <w:ilvl w:val="0"/>
-          <w:numId w:val="26"/>
-        </w:numPr>
-      </w:pPr>
-      <w:r>
-        <w:rPr>
-          <w:rFonts w:ascii="Segoe UI Emoji" w:hAnsi="Segoe UI Emoji" w:cs="Segoe UI Emoji"/>
-        </w:rPr>
-        <w:t>❌</w:t>
-      </w:r>
-      <w:r>
-        <w:t xml:space="preserve"> https://drive.google.com/... (Google Drive often doesn't provide direct downloads)</w:t>
-      </w:r>
-    </w:p>
-    <w:p>
-      <w:r>
-        <w:pict w14:anchorId="22DDB2F0">
-          <v:rect id="_x0000_i1027" style="width:0;height:1.5pt" o:hralign="center" o:hrstd="t" o:hr="t" fillcolor="#a0a0a0" stroked="f"/>
-        </w:pict>
-      </w:r>
-    </w:p>
-    <w:p>
-      <w:r>
-        <w:t xml:space="preserve">Step 3: Fork and Clone the </w:t>
-      </w:r>
-      <w:proofErr w:type="spellStart"/>
-      <w:r>
-        <w:t>WinGet</w:t>
-      </w:r>
-      <w:proofErr w:type="spellEnd"/>
-      <w:r>
-        <w:t xml:space="preserve"> Repository</w:t>
-      </w:r>
-    </w:p>
-    <w:p>
-      <w:pPr>
-        <w:numPr>
-          <w:ilvl w:val="0"/>
-          <w:numId w:val="27"/>
-        </w:numPr>
-      </w:pPr>
-      <w:r>
-        <w:t xml:space="preserve">Go to the </w:t>
-      </w:r>
-      <w:hyperlink r:id="rId7" w:tgtFrame="_new" w:history="1">
-        <w:proofErr w:type="spellStart"/>
-        <w:r>
-          <w:rPr>
-            <w:rStyle w:val="Hyperlink"/>
-          </w:rPr>
-          <w:t>WinGet</w:t>
-        </w:r>
-        <w:proofErr w:type="spellEnd"/>
-        <w:r>
-          <w:rPr>
-            <w:rStyle w:val="Hyperlink"/>
-          </w:rPr>
-          <w:t xml:space="preserve"> Package Repository</w:t>
-        </w:r>
-      </w:hyperlink>
-      <w:r>
-        <w:t>.</w:t>
-      </w:r>
-    </w:p>
-    <w:p>
-      <w:pPr>
-        <w:numPr>
-          <w:ilvl w:val="0"/>
-          <w:numId w:val="27"/>
-        </w:numPr>
-      </w:pPr>
-      <w:r>
-        <w:t xml:space="preserve">Click </w:t>
-      </w:r>
-      <w:r>
-        <w:rPr>
-          <w:b/>
-          <w:bCs/>
-        </w:rPr>
-        <w:t>Fork</w:t>
-      </w:r>
-      <w:r>
-        <w:t xml:space="preserve"> to create your own copy.</w:t>
-      </w:r>
-    </w:p>
-    <w:p>
-      <w:pPr>
-        <w:numPr>
-          <w:ilvl w:val="0"/>
-          <w:numId w:val="27"/>
-        </w:numPr>
-      </w:pPr>
-      <w:r>
-        <w:t>Clone it to your machine:</w:t>
+        <w:t>Step 1: Install</w:t>
+      </w:r>
+      <w:r>
+        <w:t xml:space="preserve"> Inno setup and compil tracetool.iss file</w:t>
       </w:r>
     </w:p>
     <w:p>
@@ -337,9 +59,18 @@
           <w:bottom w:val="single" w:sz="4" w:space="1" w:color="auto"/>
           <w:right w:val="single" w:sz="4" w:space="4" w:color="auto"/>
         </w:pBdr>
-      </w:pPr>
-      <w:r>
-        <w:t>git clone https://github.com/YOUR-USERNAME/winget-pkgs.git</w:t>
+        <w:ind w:right="12184"/>
+        <w:rPr>
+          <w:b/>
+          <w:bCs/>
+        </w:rPr>
+      </w:pPr>
+      <w:r>
+        <w:rPr>
+          <w:b/>
+          <w:bCs/>
+        </w:rPr>
+        <w:t>winget install -e --id JRSoftware.InnoSetup</w:t>
       </w:r>
     </w:p>
     <w:p>
@@ -350,15 +81,212 @@
           <w:bottom w:val="single" w:sz="4" w:space="1" w:color="auto"/>
           <w:right w:val="single" w:sz="4" w:space="4" w:color="auto"/>
         </w:pBdr>
-      </w:pPr>
-      <w:r>
-        <w:t xml:space="preserve">cd </w:t>
-      </w:r>
-      <w:proofErr w:type="spellStart"/>
-      <w:r>
-        <w:t>winget-pkgs</w:t>
-      </w:r>
-      <w:proofErr w:type="spellEnd"/>
+        <w:ind w:right="12184"/>
+        <w:rPr>
+          <w:b/>
+          <w:bCs/>
+        </w:rPr>
+      </w:pPr>
+      <w:r>
+        <w:rPr>
+          <w:b/>
+          <w:bCs/>
+        </w:rPr>
+        <w:t>"C:\Users\tparent\AppData\Local\Programs\Inno Setup 6\Compil32.exe" /cc tracetool.iss</w:t>
+      </w:r>
+    </w:p>
+    <w:p>
+      <w:r>
+        <w:pict w14:anchorId="06526AF3">
+          <v:rect id="_x0000_i1026" style="width:0;height:1.5pt" o:hralign="center" o:hrstd="t" o:hr="t" fillcolor="#a0a0a0" stroked="f"/>
+        </w:pict>
+      </w:r>
+    </w:p>
+    <w:p>
+      <w:r>
+        <w:t>Step 2: Host the Installer Online</w:t>
+      </w:r>
+    </w:p>
+    <w:p>
+      <w:r>
+        <w:t>https://github.com/capslock66/Tracetool/blob/Develop/GithubFiles/Setup.exe</w:t>
+      </w:r>
+    </w:p>
+    <w:p>
+      <w:r>
+        <w:t>https://raw.githubusercontent.com/capslock66/Tracetool/Develop/GithubFiles/Setup.exe</w:t>
+      </w:r>
+    </w:p>
+    <w:p>
+      <w:r>
+        <w:pict w14:anchorId="22DDB2F0">
+          <v:rect id="_x0000_i1027" style="width:0;height:1.5pt" o:hralign="center" o:hrstd="t" o:hr="t" fillcolor="#a0a0a0" stroked="f"/>
+        </w:pict>
+      </w:r>
+    </w:p>
+    <w:p>
+      <w:r>
+        <w:t>Step 3: Fork and Clone the WinGet Repository</w:t>
+      </w:r>
+    </w:p>
+    <w:p>
+      <w:pPr>
+        <w:numPr>
+          <w:ilvl w:val="0"/>
+          <w:numId w:val="27"/>
+        </w:numPr>
+      </w:pPr>
+      <w:r>
+        <w:t xml:space="preserve">Go to the </w:t>
+      </w:r>
+      <w:r>
+        <w:t xml:space="preserve">WinGet Package </w:t>
+      </w:r>
+      <w:r>
+        <w:t>R</w:t>
+      </w:r>
+      <w:r>
+        <w:t>epository</w:t>
+      </w:r>
+      <w:r>
+        <w:t>:</w:t>
+      </w:r>
+      <w:r>
+        <w:t xml:space="preserve"> </w:t>
+      </w:r>
+      <w:r>
+        <w:t>https://github.com/microsoft/winget-pkgs</w:t>
+      </w:r>
+    </w:p>
+    <w:p>
+      <w:pPr>
+        <w:numPr>
+          <w:ilvl w:val="0"/>
+          <w:numId w:val="27"/>
+        </w:numPr>
+      </w:pPr>
+      <w:r>
+        <w:t xml:space="preserve">Click </w:t>
+      </w:r>
+      <w:r>
+        <w:rPr>
+          <w:b/>
+          <w:bCs/>
+        </w:rPr>
+        <w:t>Fork</w:t>
+      </w:r>
+      <w:r>
+        <w:t xml:space="preserve"> to create your own copy.</w:t>
+      </w:r>
+    </w:p>
+    <w:p>
+      <w:pPr>
+        <w:ind w:left="360"/>
+      </w:pPr>
+      <w:r>
+        <w:drawing>
+          <wp:inline distT="0" distB="0" distL="0" distR="0" wp14:anchorId="3542B854" wp14:editId="0E5CF21D">
+            <wp:extent cx="4181475" cy="2056275"/>
+            <wp:effectExtent l="0" t="0" r="0" b="1270"/>
+            <wp:docPr id="1899925318" name="Picture 1"/>
+            <wp:cNvGraphicFramePr>
+              <a:graphicFrameLocks xmlns:a="http://schemas.openxmlformats.org/drawingml/2006/main" noChangeAspect="1"/>
+            </wp:cNvGraphicFramePr>
+            <a:graphic xmlns:a="http://schemas.openxmlformats.org/drawingml/2006/main">
+              <a:graphicData uri="http://schemas.openxmlformats.org/drawingml/2006/picture">
+                <pic:pic xmlns:pic="http://schemas.openxmlformats.org/drawingml/2006/picture">
+                  <pic:nvPicPr>
+                    <pic:cNvPr id="1899925318" name=""/>
+                    <pic:cNvPicPr/>
+                  </pic:nvPicPr>
+                  <pic:blipFill>
+                    <a:blip r:embed="rId7"/>
+                    <a:stretch>
+                      <a:fillRect/>
+                    </a:stretch>
+                  </pic:blipFill>
+                  <pic:spPr>
+                    <a:xfrm>
+                      <a:off x="0" y="0"/>
+                      <a:ext cx="4196195" cy="2063514"/>
+                    </a:xfrm>
+                    <a:prstGeom prst="rect">
+                      <a:avLst/>
+                    </a:prstGeom>
+                  </pic:spPr>
+                </pic:pic>
+              </a:graphicData>
+            </a:graphic>
+          </wp:inline>
+        </w:drawing>
+      </w:r>
+    </w:p>
+    <w:p>
+      <w:pPr>
+        <w:numPr>
+          <w:ilvl w:val="0"/>
+          <w:numId w:val="27"/>
+        </w:numPr>
+      </w:pPr>
+      <w:r>
+        <w:t>Clone it to your machine:</w:t>
+      </w:r>
+    </w:p>
+    <w:p>
+      <w:pPr>
+        <w:ind w:left="360"/>
+      </w:pPr>
+      <w:r>
+        <w:t>You may need to increase buffer size</w:t>
+      </w:r>
+    </w:p>
+    <w:p>
+      <w:pPr>
+        <w:pBdr>
+          <w:top w:val="single" w:sz="4" w:space="1" w:color="auto"/>
+          <w:left w:val="single" w:sz="4" w:space="4" w:color="auto"/>
+          <w:bottom w:val="single" w:sz="4" w:space="1" w:color="auto"/>
+          <w:right w:val="single" w:sz="4" w:space="0" w:color="auto"/>
+        </w:pBdr>
+        <w:ind w:right="14452"/>
+      </w:pPr>
+      <w:r>
+        <w:t>git config --global http.postBuffer 157286400</w:t>
+      </w:r>
+    </w:p>
+    <w:p>
+      <w:pPr>
+        <w:pBdr>
+          <w:top w:val="single" w:sz="4" w:space="1" w:color="auto"/>
+          <w:left w:val="single" w:sz="4" w:space="4" w:color="auto"/>
+          <w:bottom w:val="single" w:sz="4" w:space="1" w:color="auto"/>
+          <w:right w:val="single" w:sz="4" w:space="0" w:color="auto"/>
+        </w:pBdr>
+        <w:ind w:right="14452"/>
+      </w:pPr>
+      <w:r>
+        <w:t xml:space="preserve">git clone </w:t>
+      </w:r>
+      <w:r>
+        <w:t>https://github.com/capslock66/winget-pkgs</w:t>
+      </w:r>
+      <w:r>
+        <w:t>.git</w:t>
+      </w:r>
+    </w:p>
+    <w:p>
+      <w:pPr>
+        <w:pBdr>
+          <w:top w:val="single" w:sz="4" w:space="1" w:color="auto"/>
+          <w:left w:val="single" w:sz="4" w:space="4" w:color="auto"/>
+          <w:bottom w:val="single" w:sz="4" w:space="1" w:color="auto"/>
+          <w:right w:val="single" w:sz="4" w:space="0" w:color="auto"/>
+        </w:pBdr>
+        <w:ind w:right="14452"/>
+      </w:pPr>
+      <w:r>
+        <w:t>cd winget-pkgs</w:t>
+      </w:r>
     </w:p>
     <w:p>
       <w:r>
@@ -373,13 +301,8 @@
       </w:r>
     </w:p>
     <w:p>
-      <w:proofErr w:type="spellStart"/>
-      <w:r>
-        <w:t>WinGet</w:t>
-      </w:r>
-      <w:proofErr w:type="spellEnd"/>
-      <w:r>
-        <w:t xml:space="preserve"> requires a YAML manifest that describes your application.</w:t>
+      <w:r>
+        <w:t>WinGet requires a YAML manifest that describes your application.</w:t>
       </w:r>
     </w:p>
     <w:p>
@@ -395,33 +318,21 @@
           <w:bottom w:val="single" w:sz="4" w:space="1" w:color="auto"/>
           <w:right w:val="single" w:sz="4" w:space="4" w:color="auto"/>
         </w:pBdr>
-      </w:pPr>
-      <w:proofErr w:type="spellStart"/>
-      <w:r>
-        <w:t>winget</w:t>
-      </w:r>
-      <w:proofErr w:type="spellEnd"/>
-      <w:r>
-        <w:t xml:space="preserve"> create --</w:t>
-      </w:r>
-      <w:proofErr w:type="spellStart"/>
-      <w:r>
-        <w:t>urls</w:t>
-      </w:r>
-      <w:proofErr w:type="spellEnd"/>
-      <w:r>
-        <w:t xml:space="preserve"> "https://yourwebsite.com/</w:t>
-      </w:r>
-      <w:proofErr w:type="spellStart"/>
-      <w:r>
-        <w:t>tracetool</w:t>
-      </w:r>
-      <w:proofErr w:type="spellEnd"/>
-      <w:r>
-        <w:t>/setup.exe" --interactive</w:t>
-      </w:r>
-    </w:p>
-    <w:p/>
+        <w:ind w:right="11475"/>
+      </w:pPr>
+      <w:r>
+        <w:t>winget create --urls "</w:t>
+      </w:r>
+      <w:r>
+        <w:t xml:space="preserve"> </w:t>
+      </w:r>
+      <w:r>
+        <w:t>https://github.com/capslock66/Tracetool/blob/Develop/GithubFiles/Setup.exe</w:t>
+      </w:r>
+      <w:r>
+        <w:t>" --interactive</w:t>
+      </w:r>
+    </w:p>
     <w:p>
       <w:r>
         <w:t>This will open an interactive prompt where you enter details like name, publisher, version, etc.</w:t>
@@ -443,15 +354,7 @@
     <w:p>
       <w:r>
         <w:lastRenderedPageBreak/>
-        <w:t>If you prefer, create these files manually inside the manifests\t\</w:t>
-      </w:r>
-      <w:proofErr w:type="spellStart"/>
-      <w:r>
-        <w:t>Tracetool</w:t>
-      </w:r>
-      <w:proofErr w:type="spellEnd"/>
-      <w:r>
-        <w:t>\1.0.0 folder.</w:t>
+        <w:t>If you prefer, create these files manually inside the manifests\t\Tracetool\1.0.0 folder.</w:t>
       </w:r>
     </w:p>
     <w:p>
@@ -461,21 +364,12 @@
           <w:numId w:val="28"/>
         </w:numPr>
       </w:pPr>
-      <w:proofErr w:type="spellStart"/>
       <w:r>
         <w:rPr>
           <w:b/>
           <w:bCs/>
         </w:rPr>
-        <w:t>Tracetool.yaml</w:t>
-      </w:r>
-      <w:proofErr w:type="spellEnd"/>
-      <w:r>
-        <w:rPr>
-          <w:b/>
-          <w:bCs/>
-        </w:rPr>
-        <w:t xml:space="preserve"> (Main Manifest)</w:t>
+        <w:t>Tracetool.yaml (Main Manifest)</w:t>
       </w:r>
     </w:p>
     <w:p>
@@ -488,13 +382,8 @@
         </w:pBdr>
       </w:pPr>
       <w:r>
-        <w:t xml:space="preserve">Id: </w:t>
-      </w:r>
-      <w:proofErr w:type="spellStart"/>
-      <w:r>
-        <w:t>YourCompany.Tracetool</w:t>
-      </w:r>
-      <w:proofErr w:type="spellEnd"/>
+        <w:t>Id: YourCompany.Tracetool</w:t>
+      </w:r>
     </w:p>
     <w:p>
       <w:pPr>
@@ -506,13 +395,8 @@
         </w:pBdr>
       </w:pPr>
       <w:r>
-        <w:t xml:space="preserve">Publisher: </w:t>
-      </w:r>
-      <w:proofErr w:type="spellStart"/>
-      <w:r>
-        <w:t>YourCompany</w:t>
-      </w:r>
-      <w:proofErr w:type="spellEnd"/>
+        <w:t>Publisher: YourCompany</w:t>
+      </w:r>
     </w:p>
     <w:p>
       <w:pPr>
@@ -524,13 +408,8 @@
         </w:pBdr>
       </w:pPr>
       <w:r>
-        <w:t xml:space="preserve">Name: </w:t>
-      </w:r>
-      <w:proofErr w:type="spellStart"/>
-      <w:r>
-        <w:t>Tracetool</w:t>
-      </w:r>
-      <w:proofErr w:type="spellEnd"/>
+        <w:t>Name: Tracetool</w:t>
+      </w:r>
     </w:p>
     <w:p>
       <w:pPr>
@@ -567,13 +446,8 @@
           <w:right w:val="single" w:sz="4" w:space="4" w:color="auto"/>
         </w:pBdr>
       </w:pPr>
-      <w:proofErr w:type="spellStart"/>
-      <w:r>
-        <w:t>InstallerType</w:t>
-      </w:r>
-      <w:proofErr w:type="spellEnd"/>
-      <w:r>
-        <w:t>: exe</w:t>
+      <w:r>
+        <w:t>InstallerType: exe</w:t>
       </w:r>
     </w:p>
     <w:p>
@@ -612,15 +486,7 @@
         </w:pBdr>
       </w:pPr>
       <w:r>
-        <w:t xml:space="preserve">    </w:t>
-      </w:r>
-      <w:proofErr w:type="spellStart"/>
-      <w:r>
-        <w:t>InstallerUrl</w:t>
-      </w:r>
-      <w:proofErr w:type="spellEnd"/>
-      <w:r>
-        <w:t>: https://yourwebsite.com/tracetool/setup.exe</w:t>
+        <w:t xml:space="preserve">    InstallerUrl: https://yourwebsite.com/tracetool/setup.exe</w:t>
       </w:r>
     </w:p>
     <w:p>
@@ -659,15 +525,7 @@
         </w:pBdr>
       </w:pPr>
       <w:r>
-        <w:t xml:space="preserve">    </w:t>
-      </w:r>
-      <w:proofErr w:type="spellStart"/>
-      <w:r>
-        <w:t>InstallModes</w:t>
-      </w:r>
-      <w:proofErr w:type="spellEnd"/>
-      <w:r>
-        <w:t>:</w:t>
+        <w:t xml:space="preserve">    InstallModes:</w:t>
       </w:r>
     </w:p>
     <w:p>
@@ -706,13 +564,8 @@
         </w:pBdr>
       </w:pPr>
       <w:r>
-        <w:t xml:space="preserve">  - </w:t>
-      </w:r>
-      <w:proofErr w:type="spellStart"/>
-      <w:r>
-        <w:t>tracetool</w:t>
-      </w:r>
-      <w:proofErr w:type="spellEnd"/>
+        <w:t xml:space="preserve">  - tracetool</w:t>
+      </w:r>
     </w:p>
     <w:p>
       <w:pPr>
@@ -723,13 +576,8 @@
           <w:right w:val="single" w:sz="4" w:space="4" w:color="auto"/>
         </w:pBdr>
       </w:pPr>
-      <w:proofErr w:type="spellStart"/>
-      <w:r>
-        <w:t>ShortDescription</w:t>
-      </w:r>
-      <w:proofErr w:type="spellEnd"/>
-      <w:r>
-        <w:t>: A powerful tracing tool for developers.</w:t>
+      <w:r>
+        <w:t>ShortDescription: A powerful tracing tool for developers.</w:t>
       </w:r>
     </w:p>
     <w:p>
@@ -739,21 +587,12 @@
           <w:numId w:val="29"/>
         </w:numPr>
       </w:pPr>
-      <w:proofErr w:type="spellStart"/>
       <w:r>
         <w:rPr>
           <w:b/>
           <w:bCs/>
         </w:rPr>
-        <w:t>Locale.yaml</w:t>
-      </w:r>
-      <w:proofErr w:type="spellEnd"/>
-      <w:r>
-        <w:rPr>
-          <w:b/>
-          <w:bCs/>
-        </w:rPr>
-        <w:t xml:space="preserve"> (for metadata)</w:t>
+        <w:t>Locale.yaml (for metadata)</w:t>
       </w:r>
     </w:p>
     <w:p>
@@ -765,19 +604,9 @@
           <w:right w:val="single" w:sz="4" w:space="4" w:color="auto"/>
         </w:pBdr>
       </w:pPr>
-      <w:proofErr w:type="spellStart"/>
-      <w:r>
-        <w:t>PackageIdentifier</w:t>
-      </w:r>
-      <w:proofErr w:type="spellEnd"/>
-      <w:r>
-        <w:t xml:space="preserve">: </w:t>
-      </w:r>
-      <w:proofErr w:type="spellStart"/>
-      <w:r>
-        <w:t>YourCompany.Tracetool</w:t>
-      </w:r>
-      <w:proofErr w:type="spellEnd"/>
+      <w:r>
+        <w:t>PackageIdentifier: YourCompany.Tracetool</w:t>
+      </w:r>
     </w:p>
     <w:p>
       <w:pPr>
@@ -788,13 +617,8 @@
           <w:right w:val="single" w:sz="4" w:space="4" w:color="auto"/>
         </w:pBdr>
       </w:pPr>
-      <w:proofErr w:type="spellStart"/>
-      <w:r>
-        <w:t>PackageVersion</w:t>
-      </w:r>
-      <w:proofErr w:type="spellEnd"/>
-      <w:r>
-        <w:t>: 1.0.0</w:t>
+      <w:r>
+        <w:t>PackageVersion: 1.0.0</w:t>
       </w:r>
     </w:p>
     <w:p>
@@ -807,15 +631,7 @@
         </w:pBdr>
       </w:pPr>
       <w:r>
-        <w:t xml:space="preserve">Locale: </w:t>
-      </w:r>
-      <w:proofErr w:type="spellStart"/>
-      <w:r>
-        <w:t>en</w:t>
-      </w:r>
-      <w:proofErr w:type="spellEnd"/>
-      <w:r>
-        <w:t>-US</w:t>
+        <w:t>Locale: en-US</w:t>
       </w:r>
     </w:p>
     <w:p>
@@ -828,13 +644,8 @@
         </w:pBdr>
       </w:pPr>
       <w:r>
-        <w:t xml:space="preserve">Publisher: </w:t>
-      </w:r>
-      <w:proofErr w:type="spellStart"/>
-      <w:r>
-        <w:t>YourCompany</w:t>
-      </w:r>
-      <w:proofErr w:type="spellEnd"/>
+        <w:t>Publisher: YourCompany</w:t>
+      </w:r>
     </w:p>
     <w:p>
       <w:pPr>
@@ -845,13 +656,8 @@
           <w:right w:val="single" w:sz="4" w:space="4" w:color="auto"/>
         </w:pBdr>
       </w:pPr>
-      <w:proofErr w:type="spellStart"/>
-      <w:r>
-        <w:t>PublisherUrl</w:t>
-      </w:r>
-      <w:proofErr w:type="spellEnd"/>
-      <w:r>
-        <w:t>: https://yourwebsite.com</w:t>
+      <w:r>
+        <w:t>PublisherUrl: https://yourwebsite.com</w:t>
       </w:r>
     </w:p>
     <w:p>
@@ -863,19 +669,9 @@
           <w:right w:val="single" w:sz="4" w:space="4" w:color="auto"/>
         </w:pBdr>
       </w:pPr>
-      <w:proofErr w:type="spellStart"/>
-      <w:r>
-        <w:t>PackageName</w:t>
-      </w:r>
-      <w:proofErr w:type="spellEnd"/>
-      <w:r>
-        <w:t xml:space="preserve">: </w:t>
-      </w:r>
-      <w:proofErr w:type="spellStart"/>
-      <w:r>
-        <w:t>Tracetool</w:t>
-      </w:r>
-      <w:proofErr w:type="spellEnd"/>
+      <w:r>
+        <w:t>PackageName: Tracetool</w:t>
+      </w:r>
     </w:p>
     <w:p>
       <w:pPr>
@@ -886,13 +682,8 @@
           <w:right w:val="single" w:sz="4" w:space="4" w:color="auto"/>
         </w:pBdr>
       </w:pPr>
-      <w:proofErr w:type="spellStart"/>
-      <w:r>
-        <w:t>ShortDescription</w:t>
-      </w:r>
-      <w:proofErr w:type="spellEnd"/>
-      <w:r>
-        <w:t>: A powerful tracing tool for developers.</w:t>
+      <w:r>
+        <w:t>ShortDescription: A powerful tracing tool for developers.</w:t>
       </w:r>
     </w:p>
     <w:p>
@@ -902,21 +693,12 @@
           <w:numId w:val="30"/>
         </w:numPr>
       </w:pPr>
-      <w:proofErr w:type="spellStart"/>
       <w:r>
         <w:rPr>
           <w:b/>
           <w:bCs/>
         </w:rPr>
-        <w:t>Version.yaml</w:t>
-      </w:r>
-      <w:proofErr w:type="spellEnd"/>
-      <w:r>
-        <w:rPr>
-          <w:b/>
-          <w:bCs/>
-        </w:rPr>
-        <w:t xml:space="preserve"> (Tracks latest version)</w:t>
+        <w:t>Version.yaml (Tracks latest version)</w:t>
       </w:r>
     </w:p>
     <w:p>
@@ -928,19 +710,9 @@
           <w:right w:val="single" w:sz="4" w:space="4" w:color="auto"/>
         </w:pBdr>
       </w:pPr>
-      <w:proofErr w:type="spellStart"/>
-      <w:r>
-        <w:t>PackageIdentifier</w:t>
-      </w:r>
-      <w:proofErr w:type="spellEnd"/>
-      <w:r>
-        <w:t xml:space="preserve">: </w:t>
-      </w:r>
-      <w:proofErr w:type="spellStart"/>
-      <w:r>
-        <w:t>YourCompany.Tracetool</w:t>
-      </w:r>
-      <w:proofErr w:type="spellEnd"/>
+      <w:r>
+        <w:t>PackageIdentifier: YourCompany.Tracetool</w:t>
+      </w:r>
     </w:p>
     <w:p>
       <w:pPr>
@@ -965,15 +737,7 @@
         </w:pBdr>
       </w:pPr>
       <w:r>
-        <w:t xml:space="preserve">  - </w:t>
-      </w:r>
-      <w:proofErr w:type="spellStart"/>
-      <w:r>
-        <w:t>PackageVersion</w:t>
-      </w:r>
-      <w:proofErr w:type="spellEnd"/>
-      <w:r>
-        <w:t>: 1.0.0</w:t>
+        <w:t xml:space="preserve">  - PackageVersion: 1.0.0</w:t>
       </w:r>
     </w:p>
     <w:p>
@@ -986,23 +750,7 @@
         </w:pBdr>
       </w:pPr>
       <w:r>
-        <w:t xml:space="preserve">    </w:t>
-      </w:r>
-      <w:proofErr w:type="spellStart"/>
-      <w:r>
-        <w:t>DefaultLocale</w:t>
-      </w:r>
-      <w:proofErr w:type="spellEnd"/>
-      <w:r>
-        <w:t xml:space="preserve">: </w:t>
-      </w:r>
-      <w:proofErr w:type="spellStart"/>
-      <w:r>
-        <w:t>en</w:t>
-      </w:r>
-      <w:proofErr w:type="spellEnd"/>
-      <w:r>
-        <w:t>-US</w:t>
+        <w:t xml:space="preserve">    DefaultLocale: en-US</w:t>
       </w:r>
     </w:p>
     <w:p>
@@ -1027,13 +775,8 @@
       </w:r>
     </w:p>
     <w:p>
-      <w:proofErr w:type="spellStart"/>
-      <w:r>
-        <w:t>WinGet</w:t>
-      </w:r>
-      <w:proofErr w:type="spellEnd"/>
-      <w:r>
-        <w:t xml:space="preserve"> requires a </w:t>
+      <w:r>
+        <w:t xml:space="preserve">WinGet requires a </w:t>
       </w:r>
       <w:r>
         <w:rPr>
@@ -1059,21 +802,8 @@
           <w:right w:val="single" w:sz="4" w:space="4" w:color="auto"/>
         </w:pBdr>
       </w:pPr>
-      <w:proofErr w:type="spellStart"/>
-      <w:r>
-        <w:t>certutil</w:t>
-      </w:r>
-      <w:proofErr w:type="spellEnd"/>
-      <w:r>
-        <w:t xml:space="preserve"> -</w:t>
-      </w:r>
-      <w:proofErr w:type="spellStart"/>
-      <w:r>
-        <w:t>hashfile</w:t>
-      </w:r>
-      <w:proofErr w:type="spellEnd"/>
-      <w:r>
-        <w:t xml:space="preserve"> setup.exe SHA256</w:t>
+      <w:r>
+        <w:t>certutil -hashfile setup.exe SHA256</w:t>
       </w:r>
     </w:p>
     <w:p>
@@ -1090,13 +820,8 @@
     </w:p>
     <w:p>
       <w:r>
-        <w:t xml:space="preserve">Step 6: Submit the Manifest to </w:t>
-      </w:r>
-      <w:proofErr w:type="spellStart"/>
-      <w:r>
-        <w:t>WinGet</w:t>
-      </w:r>
-      <w:proofErr w:type="spellEnd"/>
+        <w:t>Step 6: Submit the Manifest to WinGet</w:t>
+      </w:r>
     </w:p>
     <w:p>
       <w:pPr>
@@ -1119,13 +844,8 @@
         </w:pBdr>
       </w:pPr>
       <w:r>
-        <w:t xml:space="preserve">git </w:t>
-      </w:r>
-      <w:proofErr w:type="gramStart"/>
-      <w:r>
-        <w:t>add .</w:t>
-      </w:r>
-      <w:proofErr w:type="gramEnd"/>
+        <w:t>git add .</w:t>
+      </w:r>
     </w:p>
     <w:p>
       <w:pPr>
@@ -1137,15 +857,7 @@
         </w:pBdr>
       </w:pPr>
       <w:r>
-        <w:t xml:space="preserve">git commit -m "Added </w:t>
-      </w:r>
-      <w:proofErr w:type="spellStart"/>
-      <w:r>
-        <w:t>Tracetool</w:t>
-      </w:r>
-      <w:proofErr w:type="spellEnd"/>
-      <w:r>
-        <w:t xml:space="preserve"> v1.0.0"</w:t>
+        <w:t>git commit -m "Added Tracetool v1.0.0"</w:t>
       </w:r>
     </w:p>
     <w:p>
@@ -1183,19 +895,11 @@
         <w:t xml:space="preserve"> on </w:t>
       </w:r>
       <w:hyperlink r:id="rId8" w:tgtFrame="_new" w:history="1">
-        <w:proofErr w:type="spellStart"/>
         <w:r>
           <w:rPr>
             <w:rStyle w:val="Hyperlink"/>
           </w:rPr>
-          <w:t>WinGet</w:t>
-        </w:r>
-        <w:proofErr w:type="spellEnd"/>
-        <w:r>
-          <w:rPr>
-            <w:rStyle w:val="Hyperlink"/>
-          </w:rPr>
-          <w:t xml:space="preserve"> GitHub</w:t>
+          <w:t>WinGet GitHub</w:t>
         </w:r>
       </w:hyperlink>
       <w:r>
@@ -1250,19 +954,9 @@
           <w:right w:val="single" w:sz="4" w:space="4" w:color="auto"/>
         </w:pBdr>
       </w:pPr>
-      <w:proofErr w:type="spellStart"/>
-      <w:r>
-        <w:t>winget</w:t>
-      </w:r>
-      <w:proofErr w:type="spellEnd"/>
-      <w:r>
-        <w:t xml:space="preserve"> search </w:t>
-      </w:r>
-      <w:proofErr w:type="spellStart"/>
-      <w:r>
-        <w:t>Tracetool</w:t>
-      </w:r>
-      <w:proofErr w:type="spellEnd"/>
+      <w:r>
+        <w:t>winget search Tracetool</w:t>
+      </w:r>
     </w:p>
     <w:p>
       <w:pPr>
@@ -1273,19 +967,9 @@
           <w:right w:val="single" w:sz="4" w:space="4" w:color="auto"/>
         </w:pBdr>
       </w:pPr>
-      <w:proofErr w:type="spellStart"/>
-      <w:r>
-        <w:t>winget</w:t>
-      </w:r>
-      <w:proofErr w:type="spellEnd"/>
-      <w:r>
-        <w:t xml:space="preserve"> install </w:t>
-      </w:r>
-      <w:proofErr w:type="spellStart"/>
-      <w:r>
-        <w:t>YourCompany.Tracetool</w:t>
-      </w:r>
-      <w:proofErr w:type="spellEnd"/>
+      <w:r>
+        <w:t>winget install YourCompany.Tracetool</w:t>
+      </w:r>
     </w:p>
     <w:p>
       <w:r>
@@ -1312,15 +996,7 @@
         </w:numPr>
       </w:pPr>
       <w:r>
-        <w:t xml:space="preserve">Update the YAML files (Version, </w:t>
-      </w:r>
-      <w:proofErr w:type="spellStart"/>
-      <w:r>
-        <w:t>InstallerUrl</w:t>
-      </w:r>
-      <w:proofErr w:type="spellEnd"/>
-      <w:r>
-        <w:t>, SHA256).</w:t>
+        <w:t>Update the YAML files (Version, InstallerUrl, SHA256).</w:t>
       </w:r>
     </w:p>
     <w:p>
@@ -1359,15 +1035,7 @@
         <w:t>Congratulations!</w:t>
       </w:r>
       <w:r>
-        <w:t xml:space="preserve"> Once approved, developers can install </w:t>
-      </w:r>
-      <w:proofErr w:type="spellStart"/>
-      <w:r>
-        <w:t>Tracetool</w:t>
-      </w:r>
-      <w:proofErr w:type="spellEnd"/>
-      <w:r>
-        <w:t xml:space="preserve"> with:</w:t>
+        <w:t xml:space="preserve"> Once approved, developers can install Tracetool with:</w:t>
       </w:r>
     </w:p>
     <w:p>
@@ -1379,19 +1047,9 @@
           <w:right w:val="single" w:sz="4" w:space="4" w:color="auto"/>
         </w:pBdr>
       </w:pPr>
-      <w:proofErr w:type="spellStart"/>
-      <w:r>
-        <w:t>winget</w:t>
-      </w:r>
-      <w:proofErr w:type="spellEnd"/>
-      <w:r>
-        <w:t xml:space="preserve"> install </w:t>
-      </w:r>
-      <w:proofErr w:type="spellStart"/>
-      <w:r>
-        <w:t>YourCompany.Tracetool</w:t>
-      </w:r>
-      <w:proofErr w:type="spellEnd"/>
+      <w:r>
+        <w:t>winget install YourCompany.Tracetool</w:t>
+      </w:r>
     </w:p>
     <w:p>
       <w:r>
@@ -3923,7 +3581,7 @@
   <w:style w:type="paragraph" w:default="1" w:styleId="Normal">
     <w:name w:val="Normal"/>
     <w:qFormat/>
-    <w:rsid w:val="00C6318C"/>
+    <w:rsid w:val="004276D4"/>
     <w:pPr>
       <w:spacing w:after="120" w:line="240" w:lineRule="auto"/>
     </w:pPr>
@@ -4109,7 +3767,6 @@
   <w:style w:type="character" w:default="1" w:styleId="DefaultParagraphFont">
     <w:name w:val="Default Paragraph Font"/>
     <w:uiPriority w:val="1"/>
-    <w:semiHidden/>
     <w:unhideWhenUsed/>
   </w:style>
   <w:style w:type="table" w:default="1" w:styleId="TableNormal">
@@ -4772,6 +4429,19 @@
     <w:rPr>
       <w:color w:val="605E5C"/>
       <w:shd w:val="clear" w:color="auto" w:fill="E1DFDD"/>
+    </w:rPr>
+  </w:style>
+  <w:style w:type="character" w:styleId="FollowedHyperlink">
+    <w:name w:val="FollowedHyperlink"/>
+    <w:basedOn w:val="DefaultParagraphFont"/>
+    <w:uiPriority w:val="99"/>
+    <w:semiHidden/>
+    <w:unhideWhenUsed/>
+    <w:locked/>
+    <w:rsid w:val="00C97DD6"/>
+    <w:rPr>
+      <w:color w:val="96607D" w:themeColor="followedHyperlink"/>
+      <w:u w:val="single"/>
     </w:rPr>
   </w:style>
 </w:styles>

</xml_diff>

<commit_message>
Make the setup for 32 and 64 version, update readme
</commit_message>
<xml_diff>
--- a/Winget/HowTo.docx
+++ b/Winget/HowTo.docx
@@ -151,8 +151,33 @@
         <w:t xml:space="preserve">go to </w:t>
       </w:r>
       <w:r>
-        <w:t>Winget folder and compile:</w:t>
-      </w:r>
+        <w:t>Winget folder and compile</w:t>
+      </w:r>
+      <w:r>
+        <w:t xml:space="preserve"> with a an </w:t>
+      </w:r>
+      <w:proofErr w:type="spellStart"/>
+      <w:r>
+        <w:rPr>
+          <w:u w:val="single"/>
+        </w:rPr>
+        <w:t>msdos</w:t>
+      </w:r>
+      <w:proofErr w:type="spellEnd"/>
+      <w:r>
+        <w:rPr>
+          <w:u w:val="single"/>
+        </w:rPr>
+        <w:t xml:space="preserve"> prompt</w:t>
+      </w:r>
+      <w:r>
+        <w:t xml:space="preserve">, not </w:t>
+      </w:r>
+      <w:proofErr w:type="spellStart"/>
+      <w:r>
+        <w:t>powershell</w:t>
+      </w:r>
+      <w:proofErr w:type="spellEnd"/>
     </w:p>
     <w:p>
       <w:pPr>
@@ -175,42 +200,85 @@
           <w:b/>
           <w:bCs/>
         </w:rPr>
-        <w:t xml:space="preserve">"C:\Users\tparent\AppData\Local\Programs\Inno Setup 6\Compil32.exe" /cc </w:t>
-      </w:r>
-      <w:proofErr w:type="spellStart"/>
+        <w:t>"C:\Users\tparent\AppData\Local\Programs\Inno Setup 6\Compil32.exe" /cc tracetool</w:t>
+      </w:r>
       <w:r>
         <w:rPr>
           <w:b/>
           <w:bCs/>
         </w:rPr>
-        <w:t>tracetool.iss</w:t>
+        <w:t>64</w:t>
+      </w:r>
+      <w:r>
+        <w:rPr>
+          <w:b/>
+          <w:bCs/>
+        </w:rPr>
+        <w:t>.iss</w:t>
+      </w:r>
+    </w:p>
+    <w:p>
+      <w:pPr>
+        <w:pBdr>
+          <w:top w:val="single" w:sz="4" w:space="1" w:color="auto"/>
+          <w:left w:val="single" w:sz="4" w:space="4" w:color="auto"/>
+          <w:bottom w:val="single" w:sz="4" w:space="1" w:color="auto"/>
+          <w:right w:val="single" w:sz="4" w:space="4" w:color="auto"/>
+          <w:between w:val="single" w:sz="4" w:space="1" w:color="auto"/>
+          <w:bar w:val="single" w:sz="4" w:color="auto"/>
+        </w:pBdr>
+        <w:ind w:right="12184"/>
+        <w:rPr>
+          <w:b/>
+          <w:bCs/>
+        </w:rPr>
+      </w:pPr>
+      <w:r>
+        <w:rPr>
+          <w:b/>
+          <w:bCs/>
+        </w:rPr>
+        <w:t>"C:\Users\tparent\AppData\Local\Programs\Inno Setup 6\Compil32.exe" /cc tracetool</w:t>
+      </w:r>
+      <w:r>
+        <w:rPr>
+          <w:b/>
+          <w:bCs/>
+        </w:rPr>
+        <w:t>32</w:t>
+      </w:r>
+      <w:r>
+        <w:rPr>
+          <w:b/>
+          <w:bCs/>
+        </w:rPr>
+        <w:t>.iss</w:t>
+      </w:r>
+    </w:p>
+    <w:p/>
+    <w:p>
+      <w:pPr>
+        <w:pStyle w:val="Heading1"/>
+      </w:pPr>
+      <w:r>
+        <w:t>Host the Installer Online</w:t>
+      </w:r>
+    </w:p>
+    <w:p>
+      <w:r>
+        <w:t>Push the Setup</w:t>
+      </w:r>
+      <w:r>
+        <w:t>.exe</w:t>
+      </w:r>
+      <w:r>
+        <w:t xml:space="preserve"> on </w:t>
+      </w:r>
+      <w:proofErr w:type="spellStart"/>
+      <w:r>
+        <w:t>github</w:t>
       </w:r>
       <w:proofErr w:type="spellEnd"/>
-    </w:p>
-    <w:p/>
-    <w:p>
-      <w:pPr>
-        <w:pStyle w:val="Heading1"/>
-      </w:pPr>
-      <w:r>
-        <w:t>Host the Installer Online</w:t>
-      </w:r>
-    </w:p>
-    <w:p>
-      <w:r>
-        <w:t>Push the Setup</w:t>
-      </w:r>
-      <w:r>
-        <w:t>.exe</w:t>
-      </w:r>
-      <w:r>
-        <w:t xml:space="preserve"> on </w:t>
-      </w:r>
-      <w:proofErr w:type="spellStart"/>
-      <w:r>
-        <w:t>github</w:t>
-      </w:r>
-      <w:proofErr w:type="spellEnd"/>
       <w:r>
         <w:t xml:space="preserve">, on </w:t>
       </w:r>
@@ -226,7 +294,7 @@
     <w:p>
       <w:r>
         <w:pict w14:anchorId="22DDB2F0">
-          <v:rect id="_x0000_i1027" style="width:0;height:1.5pt" o:hralign="center" o:hrstd="t" o:hr="t" fillcolor="#a0a0a0" stroked="f"/>
+          <v:rect id="_x0000_i1025" style="width:0;height:1.5pt" o:hralign="center" o:hrstd="t" o:hr="t" fillcolor="#a0a0a0" stroked="f"/>
         </w:pict>
       </w:r>
     </w:p>
@@ -422,7 +490,7 @@
     <w:p>
       <w:r>
         <w:pict w14:anchorId="2E265FAE">
-          <v:rect id="_x0000_i1028" style="width:0;height:1.5pt" o:hralign="center" o:hrstd="t" o:hr="t" fillcolor="#a0a0a0" stroked="f"/>
+          <v:rect id="_x0000_i1026" style="width:0;height:1.5pt" o:hralign="center" o:hrstd="t" o:hr="t" fillcolor="#a0a0a0" stroked="f"/>
         </w:pict>
       </w:r>
     </w:p>
@@ -495,6 +563,9 @@
     </w:p>
     <w:p>
       <w:r>
+        <w:rPr>
+          <w:noProof/>
+        </w:rPr>
         <w:drawing>
           <wp:inline distT="0" distB="0" distL="0" distR="0" wp14:anchorId="7B7552B1" wp14:editId="659BFCD7">
             <wp:extent cx="5991225" cy="1143979"/>
@@ -573,6 +644,9 @@
     </w:p>
     <w:p>
       <w:r>
+        <w:rPr>
+          <w:noProof/>
+        </w:rPr>
         <w:drawing>
           <wp:inline distT="0" distB="0" distL="0" distR="0" wp14:anchorId="7C6E5F28" wp14:editId="6F2D3AD7">
             <wp:extent cx="7791450" cy="4195396"/>
@@ -612,6 +686,9 @@
     </w:p>
     <w:p>
       <w:r>
+        <w:rPr>
+          <w:noProof/>
+        </w:rPr>
         <w:lastRenderedPageBreak/>
         <w:drawing>
           <wp:inline distT="0" distB="0" distL="0" distR="0" wp14:anchorId="32D4DF77" wp14:editId="023183C1">
@@ -656,6 +733,9 @@
         <w:spacing w:after="160" w:line="259" w:lineRule="auto"/>
       </w:pPr>
       <w:r>
+        <w:rPr>
+          <w:noProof/>
+        </w:rPr>
         <w:drawing>
           <wp:inline distT="0" distB="0" distL="0" distR="0" wp14:anchorId="7B20A5EE" wp14:editId="137F9014">
             <wp:extent cx="7477125" cy="2073303"/>
@@ -717,6 +797,9 @@
         <w:spacing w:after="160" w:line="259" w:lineRule="auto"/>
       </w:pPr>
       <w:r>
+        <w:rPr>
+          <w:noProof/>
+        </w:rPr>
         <w:drawing>
           <wp:inline distT="0" distB="0" distL="0" distR="0" wp14:anchorId="1A16AD03" wp14:editId="72F8197D">
             <wp:extent cx="9307224" cy="438211"/>
@@ -793,6 +876,9 @@
         <w:spacing w:after="160" w:line="259" w:lineRule="auto"/>
       </w:pPr>
       <w:r>
+        <w:rPr>
+          <w:noProof/>
+        </w:rPr>
         <w:drawing>
           <wp:inline distT="0" distB="0" distL="0" distR="0" wp14:anchorId="4697F70B" wp14:editId="4EED2FD2">
             <wp:extent cx="5668166" cy="523948"/>
@@ -843,6 +929,9 @@
         <w:spacing w:after="160" w:line="259" w:lineRule="auto"/>
       </w:pPr>
       <w:r>
+        <w:rPr>
+          <w:noProof/>
+        </w:rPr>
         <w:drawing>
           <wp:inline distT="0" distB="0" distL="0" distR="0" wp14:anchorId="27601281" wp14:editId="01FD27B9">
             <wp:extent cx="9554908" cy="1533739"/>
@@ -930,6 +1019,9 @@
         <w:spacing w:after="160" w:line="259" w:lineRule="auto"/>
       </w:pPr>
       <w:r>
+        <w:rPr>
+          <w:noProof/>
+        </w:rPr>
         <w:drawing>
           <wp:inline distT="0" distB="0" distL="0" distR="0" wp14:anchorId="53D89D13" wp14:editId="380EB9DE">
             <wp:extent cx="5515745" cy="1895740"/>
@@ -1034,6 +1126,9 @@
     <w:p/>
     <w:p>
       <w:r>
+        <w:rPr>
+          <w:noProof/>
+        </w:rPr>
         <w:drawing>
           <wp:inline distT="0" distB="0" distL="0" distR="0" wp14:anchorId="3CC4EFB7" wp14:editId="6F081E46">
             <wp:extent cx="8478382" cy="4755373"/>
@@ -3772,6 +3867,7 @@
   <w:style w:type="character" w:default="1" w:styleId="DefaultParagraphFont">
     <w:name w:val="Default Paragraph Font"/>
     <w:uiPriority w:val="1"/>
+    <w:semiHidden/>
     <w:unhideWhenUsed/>
   </w:style>
   <w:style w:type="table" w:default="1" w:styleId="TableNormal">

</xml_diff>

<commit_message>
update winget how to
</commit_message>
<xml_diff>
--- a/Winget/HowTo.docx
+++ b/Winget/HowTo.docx
@@ -29,39 +29,14 @@
           <w:sz w:val="72"/>
           <w:szCs w:val="72"/>
         </w:rPr>
-        <w:t xml:space="preserve">the </w:t>
-      </w:r>
-      <w:proofErr w:type="spellStart"/>
+        <w:t xml:space="preserve">the tracetool </w:t>
+      </w:r>
       <w:r>
         <w:rPr>
           <w:sz w:val="72"/>
           <w:szCs w:val="72"/>
         </w:rPr>
-        <w:t>tracetool</w:t>
-      </w:r>
-      <w:proofErr w:type="spellEnd"/>
-      <w:r>
-        <w:rPr>
-          <w:sz w:val="72"/>
-          <w:szCs w:val="72"/>
-        </w:rPr>
-        <w:t xml:space="preserve"> </w:t>
-      </w:r>
-      <w:proofErr w:type="spellStart"/>
-      <w:r>
-        <w:rPr>
-          <w:sz w:val="72"/>
-          <w:szCs w:val="72"/>
-        </w:rPr>
-        <w:t>WinGet</w:t>
-      </w:r>
-      <w:proofErr w:type="spellEnd"/>
-      <w:r>
-        <w:rPr>
-          <w:sz w:val="72"/>
-          <w:szCs w:val="72"/>
-        </w:rPr>
-        <w:t xml:space="preserve"> Package</w:t>
+        <w:t>WinGet Package</w:t>
       </w:r>
     </w:p>
     <w:p/>
@@ -73,23 +48,7 @@
         <w:t>Install</w:t>
       </w:r>
       <w:r>
-        <w:t xml:space="preserve"> Inno setup and </w:t>
-      </w:r>
-      <w:proofErr w:type="spellStart"/>
-      <w:r>
-        <w:t>compil</w:t>
-      </w:r>
-      <w:proofErr w:type="spellEnd"/>
-      <w:r>
-        <w:t xml:space="preserve"> </w:t>
-      </w:r>
-      <w:proofErr w:type="spellStart"/>
-      <w:r>
-        <w:t>tracetool.iss</w:t>
-      </w:r>
-      <w:proofErr w:type="spellEnd"/>
-      <w:r>
-        <w:t xml:space="preserve"> file</w:t>
+        <w:t xml:space="preserve"> Inno setup and compil tracetool.iss file</w:t>
       </w:r>
     </w:p>
     <w:p/>
@@ -120,31 +79,13 @@
           <w:bCs/>
         </w:rPr>
       </w:pPr>
-      <w:proofErr w:type="spellStart"/>
       <w:r>
         <w:rPr>
           <w:b/>
           <w:bCs/>
         </w:rPr>
-        <w:t>winget</w:t>
-      </w:r>
-      <w:proofErr w:type="spellEnd"/>
-      <w:r>
-        <w:rPr>
-          <w:b/>
-          <w:bCs/>
-        </w:rPr>
-        <w:t xml:space="preserve"> install -e --id </w:t>
-      </w:r>
-      <w:proofErr w:type="spellStart"/>
-      <w:r>
-        <w:rPr>
-          <w:b/>
-          <w:bCs/>
-        </w:rPr>
-        <w:t>JRSoftware.InnoSetup</w:t>
-      </w:r>
-      <w:proofErr w:type="spellEnd"/>
+        <w:t>winget install -e --id JRSoftware.InnoSetup</w:t>
+      </w:r>
     </w:p>
     <w:p>
       <w:r>
@@ -156,28 +97,15 @@
       <w:r>
         <w:t xml:space="preserve"> with a an </w:t>
       </w:r>
-      <w:proofErr w:type="spellStart"/>
       <w:r>
         <w:rPr>
           <w:u w:val="single"/>
         </w:rPr>
-        <w:t>msdos</w:t>
-      </w:r>
-      <w:proofErr w:type="spellEnd"/>
-      <w:r>
-        <w:rPr>
-          <w:u w:val="single"/>
-        </w:rPr>
-        <w:t xml:space="preserve"> prompt</w:t>
-      </w:r>
-      <w:r>
-        <w:t xml:space="preserve">, not </w:t>
-      </w:r>
-      <w:proofErr w:type="spellStart"/>
-      <w:r>
-        <w:t>powershell</w:t>
-      </w:r>
-      <w:proofErr w:type="spellEnd"/>
+        <w:t>msdos prompt</w:t>
+      </w:r>
+      <w:r>
+        <w:t>, not powershell</w:t>
+      </w:r>
     </w:p>
     <w:p>
       <w:pPr>
@@ -274,13 +202,8 @@
       <w:r>
         <w:t xml:space="preserve"> on </w:t>
       </w:r>
-      <w:proofErr w:type="spellStart"/>
-      <w:r>
-        <w:t>github</w:t>
-      </w:r>
-      <w:proofErr w:type="spellEnd"/>
-      <w:r>
-        <w:t xml:space="preserve">, on </w:t>
+      <w:r>
+        <w:t xml:space="preserve">github, on </w:t>
       </w:r>
       <w:r>
         <w:t>the release</w:t>
@@ -303,15 +226,7 @@
         <w:pStyle w:val="Heading1"/>
       </w:pPr>
       <w:r>
-        <w:t xml:space="preserve">Fork and Clone the </w:t>
-      </w:r>
-      <w:proofErr w:type="spellStart"/>
-      <w:r>
-        <w:t>WinGet</w:t>
-      </w:r>
-      <w:proofErr w:type="spellEnd"/>
-      <w:r>
-        <w:t xml:space="preserve"> Repository</w:t>
+        <w:t>Fork and Clone the WinGet Repository</w:t>
       </w:r>
     </w:p>
     <w:p>
@@ -324,13 +239,8 @@
       <w:r>
         <w:t xml:space="preserve">Go to the </w:t>
       </w:r>
-      <w:proofErr w:type="spellStart"/>
-      <w:r>
-        <w:t>WinGet</w:t>
-      </w:r>
-      <w:proofErr w:type="spellEnd"/>
-      <w:r>
-        <w:t xml:space="preserve"> Package Repository</w:t>
+      <w:r>
+        <w:t>WinGet Package Repository</w:t>
       </w:r>
       <w:r>
         <w:t>:</w:t>
@@ -435,17 +345,7 @@
         <w:ind w:right="14452"/>
       </w:pPr>
       <w:r>
-        <w:t xml:space="preserve">git config --global </w:t>
-      </w:r>
-      <w:proofErr w:type="spellStart"/>
-      <w:proofErr w:type="gramStart"/>
-      <w:r>
-        <w:t>http.postBuffer</w:t>
-      </w:r>
-      <w:proofErr w:type="spellEnd"/>
-      <w:proofErr w:type="gramEnd"/>
-      <w:r>
-        <w:t xml:space="preserve"> 157286400</w:t>
+        <w:t>git config --global http.postBuffer 157286400</w:t>
       </w:r>
     </w:p>
     <w:p>
@@ -481,11 +381,9 @@
       <w:r>
         <w:t xml:space="preserve">cd </w:t>
       </w:r>
-      <w:proofErr w:type="spellStart"/>
-      <w:r>
-        <w:t>winget-pkgs</w:t>
-      </w:r>
-      <w:proofErr w:type="spellEnd"/>
+      <w:r>
+        <w:t>c:\Thierry\winget-pkgs</w:t>
+      </w:r>
     </w:p>
     <w:p>
       <w:r>
@@ -512,13 +410,8 @@
       </w:r>
     </w:p>
     <w:p>
-      <w:proofErr w:type="spellStart"/>
-      <w:r>
-        <w:t>WinGet</w:t>
-      </w:r>
-      <w:proofErr w:type="spellEnd"/>
-      <w:r>
-        <w:t xml:space="preserve"> requires a YAML manifest that describes your application.</w:t>
+      <w:r>
+        <w:t>WinGet requires a YAML manifest that describes your application.</w:t>
       </w:r>
     </w:p>
     <w:p>
@@ -526,15 +419,7 @@
         <w:ind w:right="10200"/>
       </w:pPr>
       <w:r>
-        <w:t xml:space="preserve">First install </w:t>
-      </w:r>
-      <w:proofErr w:type="spellStart"/>
-      <w:r>
-        <w:t>winget</w:t>
-      </w:r>
-      <w:proofErr w:type="spellEnd"/>
-      <w:r>
-        <w:t xml:space="preserve"> create:</w:t>
+        <w:t>First install winget create:</w:t>
       </w:r>
     </w:p>
     <w:p>
@@ -547,19 +432,9 @@
         </w:pBdr>
         <w:ind w:right="14169"/>
       </w:pPr>
-      <w:proofErr w:type="spellStart"/>
-      <w:r>
-        <w:t>winget</w:t>
-      </w:r>
-      <w:proofErr w:type="spellEnd"/>
-      <w:r>
-        <w:t xml:space="preserve"> install </w:t>
-      </w:r>
-      <w:proofErr w:type="spellStart"/>
-      <w:r>
-        <w:t>wingetcreate</w:t>
-      </w:r>
-      <w:proofErr w:type="spellEnd"/>
+      <w:r>
+        <w:t>winget install wingetcreate</w:t>
+      </w:r>
     </w:p>
     <w:p>
       <w:r>
@@ -623,13 +498,8 @@
         </w:pBdr>
         <w:ind w:right="11901"/>
       </w:pPr>
-      <w:proofErr w:type="spellStart"/>
-      <w:r>
-        <w:t>wingetcreate</w:t>
-      </w:r>
-      <w:proofErr w:type="spellEnd"/>
-      <w:r>
-        <w:t xml:space="preserve"> new "https://github.com/capslock66/Tracetool/releases/download/Viewer_14_0/Setup.exe"</w:t>
+      <w:r>
+        <w:t>wingetcreate new "https://github.com/capslock66/Tracetool/releases/download/Viewer_14_0/Setup.exe"</w:t>
       </w:r>
     </w:p>
     <w:p>
@@ -857,19 +727,9 @@
       <w:pPr>
         <w:spacing w:after="160" w:line="259" w:lineRule="auto"/>
       </w:pPr>
-      <w:proofErr w:type="spellStart"/>
-      <w:r>
-        <w:t>winget</w:t>
-      </w:r>
-      <w:proofErr w:type="spellEnd"/>
-      <w:r>
-        <w:t xml:space="preserve"> settings --enable </w:t>
-      </w:r>
-      <w:proofErr w:type="spellStart"/>
-      <w:r>
-        <w:t>LocalManifestFiles</w:t>
-      </w:r>
-      <w:proofErr w:type="spellEnd"/>
+      <w:r>
+        <w:t>winget settings --enable LocalManifestFiles</w:t>
+      </w:r>
     </w:p>
     <w:p>
       <w:pPr>
@@ -987,32 +847,11 @@
         <w:t>You receive an email. Reply “</w:t>
       </w:r>
       <w:r>
-        <w:t>@</w:t>
-      </w:r>
-      <w:proofErr w:type="spellStart"/>
-      <w:r>
-        <w:t>microsoft</w:t>
-      </w:r>
-      <w:proofErr w:type="spellEnd"/>
-      <w:r>
-        <w:t>-</w:t>
-      </w:r>
-      <w:proofErr w:type="spellStart"/>
-      <w:r>
-        <w:t>github</w:t>
-      </w:r>
-      <w:proofErr w:type="spellEnd"/>
-      <w:r>
-        <w:t xml:space="preserve">-policy-service </w:t>
-      </w:r>
-      <w:proofErr w:type="gramStart"/>
-      <w:r>
-        <w:t>agree</w:t>
+        <w:t>@microsoft-github-policy-service agree</w:t>
       </w:r>
       <w:r>
         <w:t>“</w:t>
       </w:r>
-      <w:proofErr w:type="gramEnd"/>
     </w:p>
     <w:p>
       <w:pPr>
@@ -1101,15 +940,7 @@
         <w:spacing w:after="160" w:line="259" w:lineRule="auto"/>
       </w:pPr>
       <w:r>
-        <w:t xml:space="preserve">Continue with the </w:t>
-      </w:r>
-      <w:proofErr w:type="spellStart"/>
-      <w:r>
-        <w:t>Github</w:t>
-      </w:r>
-      <w:proofErr w:type="spellEnd"/>
-      <w:r>
-        <w:t xml:space="preserve"> pull request (</w:t>
+        <w:t>Continue with the Github pull request (</w:t>
       </w:r>
       <w:hyperlink r:id="rId17" w:history="1">
         <w:r>

</xml_diff>